<commit_message>
Push of docs. Deleting local repo to free up space
</commit_message>
<xml_diff>
--- a/HOWTOUSE.docx
+++ b/HOWTOUSE.docx
@@ -50,6 +50,45 @@
           <w:ilvl w:val="0"/>
           <w:numId w:val="1"/>
         </w:numPr>
+        <w:rPr>
+          <w:b/>
+          <w:bCs/>
+        </w:rPr>
+      </w:pPr>
+      <w:r>
+        <w:rPr>
+          <w:b/>
+          <w:bCs/>
+        </w:rPr>
+        <w:t xml:space="preserve">Download python. You can do this from </w:t>
+      </w:r>
+      <w:proofErr w:type="spellStart"/>
+      <w:r>
+        <w:rPr>
+          <w:b/>
+          <w:bCs/>
+        </w:rPr>
+        <w:t>appsAnywhere</w:t>
+      </w:r>
+      <w:proofErr w:type="spellEnd"/>
+      <w:r>
+        <w:rPr>
+          <w:b/>
+          <w:bCs/>
+        </w:rPr>
+        <w:t xml:space="preserve"> </w:t>
+      </w:r>
+      <w:r>
+        <w:t xml:space="preserve">(if you do this, try install anaconda 3.9.12 as its what I’m using, this isn’t a necessity though). </w:t>
+      </w:r>
+    </w:p>
+    <w:p>
+      <w:pPr>
+        <w:pStyle w:val="ListParagraph"/>
+        <w:numPr>
+          <w:ilvl w:val="0"/>
+          <w:numId w:val="1"/>
+        </w:numPr>
       </w:pPr>
       <w:r>
         <w:t xml:space="preserve">Option 1: </w:t>
@@ -164,6 +203,54 @@
       </w:pPr>
       <w:r>
         <w:t>Cd downloads/backgammon</w:t>
+      </w:r>
+    </w:p>
+    <w:p>
+      <w:pPr>
+        <w:pStyle w:val="ListParagraph"/>
+        <w:numPr>
+          <w:ilvl w:val="2"/>
+          <w:numId w:val="1"/>
+        </w:numPr>
+      </w:pPr>
+      <w:r>
+        <w:t>Once you’ve navigated to backgammon, type “</w:t>
+      </w:r>
+      <w:proofErr w:type="spellStart"/>
+      <w:r>
+        <w:t>dir</w:t>
+      </w:r>
+      <w:proofErr w:type="spellEnd"/>
+      <w:r>
+        <w:t>” into the command prompt and ensure you see “Code”, “Images” and “requirements.txt” in there</w:t>
+      </w:r>
+    </w:p>
+    <w:p>
+      <w:pPr>
+        <w:pStyle w:val="ListParagraph"/>
+        <w:numPr>
+          <w:ilvl w:val="3"/>
+          <w:numId w:val="1"/>
+        </w:numPr>
+      </w:pPr>
+      <w:r>
+        <w:t>If not, but you see something like “</w:t>
+      </w:r>
+      <w:proofErr w:type="spellStart"/>
+      <w:r>
+        <w:t>OpenBG</w:t>
+      </w:r>
+      <w:proofErr w:type="spellEnd"/>
+      <w:r>
+        <w:t>” or “OpenBGV2”, use the “cd” command to navigate there as well. Run the ‘</w:t>
+      </w:r>
+      <w:proofErr w:type="spellStart"/>
+      <w:r>
+        <w:t>dir</w:t>
+      </w:r>
+      <w:proofErr w:type="spellEnd"/>
+      <w:r>
+        <w:t>’ command again and ensure you see Code, Images and requirements.txt. if not, send me a photo of what you see and I’ll try sort it out</w:t>
       </w:r>
     </w:p>
     <w:p>
@@ -498,6 +585,7 @@
         </w:numPr>
       </w:pPr>
       <w:r>
+        <w:lastRenderedPageBreak/>
         <w:t xml:space="preserve">After pressing enter, wait for a little bit. </w:t>
       </w:r>
       <w:r>
@@ -507,7 +595,76 @@
         <w:t>ou should eventually have a window open. This is the game!</w:t>
       </w:r>
     </w:p>
-    <w:p/>
+    <w:p>
+      <w:pPr>
+        <w:pStyle w:val="ListParagraph"/>
+        <w:numPr>
+          <w:ilvl w:val="0"/>
+          <w:numId w:val="1"/>
+        </w:numPr>
+      </w:pPr>
+      <w:r>
+        <w:t>Here’s what it looks like when I do it on the command prompt on a library windows pc</w:t>
+      </w:r>
+      <w:r>
+        <w:t xml:space="preserve">. Note how the first time I tried to pip install -r requirements.txt it didn’t work because I needed to navigate into the OpenBGV2 folder. </w:t>
+      </w:r>
+    </w:p>
+    <w:p>
+      <w:r>
+        <w:rPr>
+          <w:noProof/>
+        </w:rPr>
+        <w:drawing>
+          <wp:inline distT="0" distB="0" distL="0" distR="0" wp14:anchorId="2DFC9624" wp14:editId="132EB7B5">
+            <wp:extent cx="3551338" cy="5526641"/>
+            <wp:effectExtent l="2857" t="0" r="0" b="0"/>
+            <wp:docPr id="25263922" name="Picture 1" descr="A screenshot of a computer&#10;&#10;AI-generated content may be incorrect."/>
+            <wp:cNvGraphicFramePr>
+              <a:graphicFrameLocks xmlns:a="http://schemas.openxmlformats.org/drawingml/2006/main" noChangeAspect="1"/>
+            </wp:cNvGraphicFramePr>
+            <a:graphic xmlns:a="http://schemas.openxmlformats.org/drawingml/2006/main">
+              <a:graphicData uri="http://schemas.openxmlformats.org/drawingml/2006/picture">
+                <pic:pic xmlns:pic="http://schemas.openxmlformats.org/drawingml/2006/picture">
+                  <pic:nvPicPr>
+                    <pic:cNvPr id="25263922" name="Picture 1" descr="A screenshot of a computer&#10;&#10;AI-generated content may be incorrect."/>
+                    <pic:cNvPicPr/>
+                  </pic:nvPicPr>
+                  <pic:blipFill rotWithShape="1">
+                    <a:blip r:embed="rId10" cstate="print">
+                      <a:extLst>
+                        <a:ext uri="{28A0092B-C50C-407E-A947-70E740481C1C}">
+                          <a14:useLocalDpi xmlns:a14="http://schemas.microsoft.com/office/drawing/2010/main" val="0"/>
+                        </a:ext>
+                      </a:extLst>
+                    </a:blip>
+                    <a:srcRect l="35910" r="17584" b="3500"/>
+                    <a:stretch/>
+                  </pic:blipFill>
+                  <pic:spPr bwMode="auto">
+                    <a:xfrm rot="5400000">
+                      <a:off x="0" y="0"/>
+                      <a:ext cx="3551732" cy="5527254"/>
+                    </a:xfrm>
+                    <a:prstGeom prst="rect">
+                      <a:avLst/>
+                    </a:prstGeom>
+                    <a:ln>
+                      <a:noFill/>
+                    </a:ln>
+                    <a:extLst>
+                      <a:ext uri="{53640926-AAD7-44D8-BBD7-CCE9431645EC}">
+                        <a14:shadowObscured xmlns:a14="http://schemas.microsoft.com/office/drawing/2010/main"/>
+                      </a:ext>
+                    </a:extLst>
+                  </pic:spPr>
+                </pic:pic>
+              </a:graphicData>
+            </a:graphic>
+          </wp:inline>
+        </w:drawing>
+      </w:r>
+    </w:p>
     <w:p>
       <w:pPr>
         <w:pStyle w:val="Heading2"/>
@@ -576,7 +733,6 @@
         </w:numPr>
       </w:pPr>
       <w:r>
-        <w:lastRenderedPageBreak/>
         <w:t>GENETIC</w:t>
       </w:r>
     </w:p>
@@ -688,7 +844,7 @@
                     <pic:cNvPicPr/>
                   </pic:nvPicPr>
                   <pic:blipFill>
-                    <a:blip r:embed="rId10">
+                    <a:blip r:embed="rId11">
                       <a:extLst>
                         <a:ext uri="{28A0092B-C50C-407E-A947-70E740481C1C}">
                           <a14:useLocalDpi xmlns:a14="http://schemas.microsoft.com/office/drawing/2010/main" val="0"/>
@@ -731,12 +887,32 @@
         <w:t>CAPITALS MATTER. If you get an error, let me know asap and copy the error message to send to me</w:t>
       </w:r>
     </w:p>
+    <w:p>
+      <w:pPr>
+        <w:pStyle w:val="ListParagraph"/>
+        <w:numPr>
+          <w:ilvl w:val="1"/>
+          <w:numId w:val="1"/>
+        </w:numPr>
+      </w:pPr>
+      <w:r>
+        <w:rPr>
+          <w:b/>
+          <w:bCs/>
+        </w:rPr>
+        <w:t xml:space="preserve">If it doesn’t work with python Code/main.py, try again with python3 Code/main.py </w:t>
+      </w:r>
+      <w:r>
+        <w:t xml:space="preserve">if this doesn’t work, send me a photo and I’ll sort it out. </w:t>
+      </w:r>
+    </w:p>
     <w:p/>
     <w:p>
       <w:pPr>
         <w:pStyle w:val="Heading2"/>
       </w:pPr>
       <w:r>
+        <w:lastRenderedPageBreak/>
         <w:t>Playing the game</w:t>
       </w:r>
     </w:p>
@@ -974,7 +1150,6 @@
         </w:numPr>
       </w:pPr>
       <w:r>
-        <w:lastRenderedPageBreak/>
         <w:t>Where {AI} is the AI you want to play</w:t>
       </w:r>
     </w:p>

</xml_diff>